<commit_message>
Update resume content with career coach feedback and structural improvements
- Refresh summary, tagline, and all experience bullets per career coach guidance
- Reposition to software engineering leader with UI/web application focus
- Move Technical section above Experience in all formats
- Remove Focus Areas section
- Add Azure and Cloudflare to Cloud & Infrastructure
- Add Bootstrap to Frameworks
- Include location and email in downloadable PDF and Word resume headers
- Fix <br> tag extraction so tagline renders correctly in PDF and Word

Co-Authored-By: Claude Sonnet 4.6 <noreply@anthropic.com>
</commit_message>
<xml_diff>
--- a/resume/resume.docx
+++ b/resume/resume.docx
@@ -16,7 +16,7 @@
         <w:spacing w:after="60"/>
       </w:pPr>
       <w:r>
-        <w:t xml:space="preserve">Senior Engineering LeaderPlatform, Enablement &amp; Architecture</w:t>
+        <w:t xml:space="preserve">Web Application Development, Technical Leadership</w:t>
       </w:r>
     </w:p>
     <w:p>
@@ -30,7 +30,7 @@
         <w:rPr>
           <w:color w:val="12456E"/>
         </w:rPr>
-        <w:t xml:space="preserve">joebader.com | linkedin.com/in/josephbader</w:t>
+        <w:t xml:space="preserve">Philadelphia, PA 19129 | joe@joebader.com | joebader.com | linkedin.com/in/josephbader</w:t>
       </w:r>
     </w:p>
     <w:p>
@@ -47,7 +47,7 @@
         <w:spacing w:after="180"/>
       </w:pPr>
       <w:r>
-        <w:t xml:space="preserve">Engineering leader with 20+ years building web platforms across enterprise, SaaS, and startup environments. Led up to six teams (approximately 30 engineers), improving on-time delivery from 30% to 95% and lead time by 4x through operating-model, architecture, and developer-experience leadership.</w:t>
+        <w:t xml:space="preserve">Software engineering leader with 20+ years building customer-facing web applications across enterprise, SaaS, consulting, and startup environments. Hands-on experience delivering responsive web platforms, leading UI architecture, and modernizing high-traffic digital experiences used by millions of users. Background includes React, AngularJS, JavaScript, HTML, and CSS, with experience spanning UI redesign, front-end modernization, and cross-functional delivery across product, design, and engineering teams. Proven record improving usability, performance, and delivery outcomes while helping teams plan and execute complex work in agile environments.</w:t>
       </w:r>
     </w:p>
     <w:p>
@@ -56,178 +56,84 @@
         <w:spacing w:after="80" w:before="60"/>
       </w:pPr>
       <w:r>
-        <w:t xml:space="preserve">FOCUS AREAS</w:t>
-      </w:r>
-    </w:p>
-    <w:tbl>
-      <w:tblPr>
-        <w:tblW w:type="pct" w:w="100%"/>
-        <w:tblBorders>
-          <w:top w:val="single" w:color="auto" w:sz="4"/>
-          <w:left w:val="single" w:color="auto" w:sz="4"/>
-          <w:bottom w:val="single" w:color="auto" w:sz="4"/>
-          <w:right w:val="single" w:color="auto" w:sz="4"/>
-          <w:insideH w:val="single" w:color="auto" w:sz="4"/>
-          <w:insideV w:val="single" w:color="auto" w:sz="4"/>
-        </w:tblBorders>
-      </w:tblPr>
-      <w:tblGrid>
-        <w:gridCol w:w="100"/>
-        <w:gridCol w:w="100"/>
-      </w:tblGrid>
-      <w:tr>
-        <w:tc>
-          <w:tcPr>
-            <w:tcBorders>
-              <w:top w:val="none" w:color="FFFFFF" w:sz="0"/>
-              <w:left w:val="none" w:color="FFFFFF" w:sz="0"/>
-              <w:bottom w:val="none" w:color="FFFFFF" w:sz="0"/>
-              <w:right w:val="none" w:color="FFFFFF" w:sz="0"/>
-            </w:tcBorders>
-          </w:tcPr>
-          <w:p>
-            <w:pPr>
-              <w:spacing w:after="40"/>
-            </w:pPr>
-            <w:r>
-              <w:t xml:space="preserve">• Scalable SaaS and Web Platforms</w:t>
-            </w:r>
-          </w:p>
-        </w:tc>
-        <w:tc>
-          <w:tcPr>
-            <w:tcBorders>
-              <w:top w:val="none" w:color="FFFFFF" w:sz="0"/>
-              <w:left w:val="none" w:color="FFFFFF" w:sz="0"/>
-              <w:bottom w:val="none" w:color="FFFFFF" w:sz="0"/>
-              <w:right w:val="none" w:color="FFFFFF" w:sz="0"/>
-            </w:tcBorders>
-          </w:tcPr>
-          <w:p>
-            <w:pPr>
-              <w:spacing w:after="40"/>
-            </w:pPr>
-            <w:r>
-              <w:t xml:space="preserve">• Platform &amp; Engineering Enablement</w:t>
-            </w:r>
-          </w:p>
-        </w:tc>
-      </w:tr>
-      <w:tr>
-        <w:tc>
-          <w:tcPr>
-            <w:tcBorders>
-              <w:top w:val="none" w:color="FFFFFF" w:sz="0"/>
-              <w:left w:val="none" w:color="FFFFFF" w:sz="0"/>
-              <w:bottom w:val="none" w:color="FFFFFF" w:sz="0"/>
-              <w:right w:val="none" w:color="FFFFFF" w:sz="0"/>
-            </w:tcBorders>
-          </w:tcPr>
-          <w:p>
-            <w:pPr>
-              <w:spacing w:after="40"/>
-            </w:pPr>
-            <w:r>
-              <w:t xml:space="preserve">• Developer Productivity &amp; Experience</w:t>
-            </w:r>
-          </w:p>
-        </w:tc>
-        <w:tc>
-          <w:tcPr>
-            <w:tcBorders>
-              <w:top w:val="none" w:color="FFFFFF" w:sz="0"/>
-              <w:left w:val="none" w:color="FFFFFF" w:sz="0"/>
-              <w:bottom w:val="none" w:color="FFFFFF" w:sz="0"/>
-              <w:right w:val="none" w:color="FFFFFF" w:sz="0"/>
-            </w:tcBorders>
-          </w:tcPr>
-          <w:p>
-            <w:pPr>
-              <w:spacing w:after="40"/>
-            </w:pPr>
-            <w:r>
-              <w:t xml:space="preserve">• People Leadership &amp; Talent Development</w:t>
-            </w:r>
-          </w:p>
-        </w:tc>
-      </w:tr>
-      <w:tr>
-        <w:tc>
-          <w:tcPr>
-            <w:tcBorders>
-              <w:top w:val="none" w:color="FFFFFF" w:sz="0"/>
-              <w:left w:val="none" w:color="FFFFFF" w:sz="0"/>
-              <w:bottom w:val="none" w:color="FFFFFF" w:sz="0"/>
-              <w:right w:val="none" w:color="FFFFFF" w:sz="0"/>
-            </w:tcBorders>
-          </w:tcPr>
-          <w:p>
-            <w:pPr>
-              <w:spacing w:after="40"/>
-            </w:pPr>
-            <w:r>
-              <w:t xml:space="preserve">• Engineering Operating Model &amp; Org Design</w:t>
-            </w:r>
-          </w:p>
-        </w:tc>
-        <w:tc>
-          <w:tcPr>
-            <w:tcBorders>
-              <w:top w:val="none" w:color="FFFFFF" w:sz="0"/>
-              <w:left w:val="none" w:color="FFFFFF" w:sz="0"/>
-              <w:bottom w:val="none" w:color="FFFFFF" w:sz="0"/>
-              <w:right w:val="none" w:color="FFFFFF" w:sz="0"/>
-            </w:tcBorders>
-          </w:tcPr>
-          <w:p>
-            <w:pPr>
-              <w:spacing w:after="40"/>
-            </w:pPr>
-            <w:r>
-              <w:t xml:space="preserve">• AI-Assisted and Agentic Development Practices</w:t>
-            </w:r>
-          </w:p>
-        </w:tc>
-      </w:tr>
-      <w:tr>
-        <w:tc>
-          <w:tcPr>
-            <w:tcBorders>
-              <w:top w:val="none" w:color="FFFFFF" w:sz="0"/>
-              <w:left w:val="none" w:color="FFFFFF" w:sz="0"/>
-              <w:bottom w:val="none" w:color="FFFFFF" w:sz="0"/>
-              <w:right w:val="none" w:color="FFFFFF" w:sz="0"/>
-            </w:tcBorders>
-          </w:tcPr>
-          <w:p>
-            <w:pPr>
-              <w:spacing w:after="40"/>
-            </w:pPr>
-            <w:r>
-              <w:t xml:space="preserve">• Architecture Stewardship &amp; Technical Governance</w:t>
-            </w:r>
-          </w:p>
-        </w:tc>
-        <w:tc>
-          <w:tcPr>
-            <w:tcBorders>
-              <w:top w:val="none" w:color="FFFFFF" w:sz="0"/>
-              <w:left w:val="none" w:color="FFFFFF" w:sz="0"/>
-              <w:bottom w:val="none" w:color="FFFFFF" w:sz="0"/>
-              <w:right w:val="none" w:color="FFFFFF" w:sz="0"/>
-            </w:tcBorders>
-          </w:tcPr>
-          <w:p>
-            <w:pPr>
-              <w:spacing w:after="40"/>
-            </w:pPr>
-            <w:r>
-              <w:t xml:space="preserve">• Cross-Team Execution, Stakeholder Alignment &amp; Dependency Ownership</w:t>
-            </w:r>
-          </w:p>
-        </w:tc>
-      </w:tr>
-    </w:tbl>
+        <w:t xml:space="preserve">TECHNICAL</w:t>
+      </w:r>
+    </w:p>
+    <w:p>
+      <w:pPr>
+        <w:spacing w:after="35"/>
+      </w:pPr>
+      <w:r>
+        <w:rPr>
+          <w:b/>
+          <w:bCs/>
+        </w:rPr>
+        <w:t xml:space="preserve">Languages: </w:t>
+      </w:r>
+      <w:r>
+        <w:t xml:space="preserve">JavaScript, SQL, Ruby, .NET, PHP, HTML, CSS</w:t>
+      </w:r>
+    </w:p>
+    <w:p>
+      <w:pPr>
+        <w:spacing w:after="35"/>
+      </w:pPr>
+      <w:r>
+        <w:rPr>
+          <w:b/>
+          <w:bCs/>
+        </w:rPr>
+        <w:t xml:space="preserve">Frameworks: </w:t>
+      </w:r>
+      <w:r>
+        <w:t xml:space="preserve">React, AngularJS, Node.js, Ruby on Rails, Bootstrap</w:t>
+      </w:r>
+    </w:p>
+    <w:p>
+      <w:pPr>
+        <w:spacing w:after="35"/>
+      </w:pPr>
+      <w:r>
+        <w:rPr>
+          <w:b/>
+          <w:bCs/>
+        </w:rPr>
+        <w:t xml:space="preserve">Cloud &amp; Infrastructure: </w:t>
+      </w:r>
+      <w:r>
+        <w:t xml:space="preserve">AWS, Azure, Heroku, DigitalOcean, Cloudflare, Linux</w:t>
+      </w:r>
+    </w:p>
+    <w:p>
+      <w:pPr>
+        <w:spacing w:after="35"/>
+      </w:pPr>
+      <w:r>
+        <w:rPr>
+          <w:b/>
+          <w:bCs/>
+        </w:rPr>
+        <w:t xml:space="preserve">CI/CD: </w:t>
+      </w:r>
+      <w:r>
+        <w:t xml:space="preserve">Jenkins, CircleCI, Azure DevOps</w:t>
+      </w:r>
+    </w:p>
+    <w:p>
+      <w:pPr>
+        <w:spacing w:after="35"/>
+      </w:pPr>
+      <w:r>
+        <w:rPr>
+          <w:b/>
+          <w:bCs/>
+        </w:rPr>
+        <w:t xml:space="preserve">Practices: </w:t>
+      </w:r>
+      <w:r>
+        <w:t xml:space="preserve">Agile delivery, architecture stewardship, platform modernization, DevOps, DORA metrics</w:t>
+      </w:r>
+    </w:p>
     <w:p>
       <w:pPr>
         <w:pStyle w:val="Heading2"/>
@@ -281,72 +187,85 @@
         <w:spacing w:after="15"/>
       </w:pPr>
       <w:r>
-        <w:t xml:space="preserve">Led five cross-functional engineering teams (approximately 30 engineers) on a core B2B SaaS platform, improving on-time delivery from 30% to 95% while meeting reliability targets.</w:t>
-      </w:r>
-    </w:p>
-    <w:p>
-      <w:pPr>
-        <w:pStyle w:val="ListParagraph"/>
-        <w:numPr>
-          <w:ilvl w:val="0"/>
-          <w:numId w:val="2"/>
-        </w:numPr>
-        <w:spacing w:after="15"/>
-      </w:pPr>
-      <w:r>
-        <w:t xml:space="preserve">Co-designed the organization-wide engineering operating model, improving average cycle time by 3x and reducing cross-team dependency delays.</w:t>
-      </w:r>
-    </w:p>
-    <w:p>
-      <w:pPr>
-        <w:pStyle w:val="ListParagraph"/>
-        <w:numPr>
-          <w:ilvl w:val="0"/>
-          <w:numId w:val="2"/>
-        </w:numPr>
-        <w:spacing w:after="15"/>
-      </w:pPr>
-      <w:r>
-        <w:t xml:space="preserve">Scaled AI-assisted and agentic development practices from pilot teams to adoption across five teams, increasing pull request throughput by 40%.</w:t>
-      </w:r>
-    </w:p>
-    <w:p>
-      <w:pPr>
-        <w:pStyle w:val="ListParagraph"/>
-        <w:numPr>
-          <w:ilvl w:val="0"/>
-          <w:numId w:val="2"/>
-        </w:numPr>
-        <w:spacing w:after="15"/>
-      </w:pPr>
-      <w:r>
-        <w:t xml:space="preserve">Served as senior architecture reviewer for high-impact initiatives, preventing high-risk design patterns before implementation and reducing long-term platform risk.</w:t>
-      </w:r>
-    </w:p>
-    <w:p>
-      <w:pPr>
-        <w:pStyle w:val="ListParagraph"/>
-        <w:numPr>
-          <w:ilvl w:val="0"/>
-          <w:numId w:val="2"/>
-        </w:numPr>
-        <w:spacing w:after="15"/>
-      </w:pPr>
-      <w:r>
-        <w:t xml:space="preserve">Implemented DORA metrics and leadership review cadences, improving lead time for changes by 4x and increasing delivery visibility for executive planning.</w:t>
-      </w:r>
-    </w:p>
-    <w:p>
-      <w:pPr>
-        <w:pStyle w:val="ListParagraph"/>
-        <w:numPr>
-          <w:ilvl w:val="0"/>
-          <w:numId w:val="2"/>
-        </w:numPr>
-        <w:spacing w:after="15"/>
-      </w:pPr>
-      <w:r>
-        <w:t xml:space="preserve">Partnered with product and executive leadership to sequence multi-quarter initiatives, improving roadmap predictability by 90% and strengthening portfolio-level delivery confidence.</w:t>
+        <w:t xml:space="preserve">Led five cross-functional engineering teams (5–8 people each) supporting a core B2B SaaS platform, improving on-time delivery from 30% to 95% while meeting reliability targets.</w:t>
+      </w:r>
+    </w:p>
+    <w:p>
+      <w:pPr>
+        <w:pStyle w:val="ListParagraph"/>
+        <w:numPr>
+          <w:ilvl w:val="0"/>
+          <w:numId w:val="2"/>
+        </w:numPr>
+        <w:spacing w:after="15"/>
+      </w:pPr>
+      <w:r>
+        <w:t xml:space="preserve">Led a major UI modernization effort using agentic AI to migrate a legacy Bootstrap interface to the latest version, including inventorying, planning, and updating thousands of UI files.</w:t>
+      </w:r>
+    </w:p>
+    <w:p>
+      <w:pPr>
+        <w:pStyle w:val="ListParagraph"/>
+        <w:numPr>
+          <w:ilvl w:val="0"/>
+          <w:numId w:val="2"/>
+        </w:numPr>
+        <w:spacing w:after="15"/>
+      </w:pPr>
+      <w:r>
+        <w:t xml:space="preserve">Drove front-end modernization within a large existing product environment, balancing large-scale change with continuity for an established user experience.</w:t>
+      </w:r>
+    </w:p>
+    <w:p>
+      <w:pPr>
+        <w:pStyle w:val="ListParagraph"/>
+        <w:numPr>
+          <w:ilvl w:val="0"/>
+          <w:numId w:val="2"/>
+        </w:numPr>
+        <w:spacing w:after="15"/>
+      </w:pPr>
+      <w:r>
+        <w:t xml:space="preserve">Served as senior architecture reviewer for high-impact initiatives, helping teams identify weak design approaches before implementation and reducing long-term platform risk.</w:t>
+      </w:r>
+    </w:p>
+    <w:p>
+      <w:pPr>
+        <w:pStyle w:val="ListParagraph"/>
+        <w:numPr>
+          <w:ilvl w:val="0"/>
+          <w:numId w:val="2"/>
+        </w:numPr>
+        <w:spacing w:after="15"/>
+      </w:pPr>
+      <w:r>
+        <w:t xml:space="preserve">Partnered with product and engineering leadership to sequence multi-quarter initiatives, improving roadmap predictability and strengthening delivery confidence.</w:t>
+      </w:r>
+    </w:p>
+    <w:p>
+      <w:pPr>
+        <w:pStyle w:val="ListParagraph"/>
+        <w:numPr>
+          <w:ilvl w:val="0"/>
+          <w:numId w:val="2"/>
+        </w:numPr>
+        <w:spacing w:after="15"/>
+      </w:pPr>
+      <w:r>
+        <w:t xml:space="preserve">Scaled AI-assisted development practices across five teams, increasing pull request throughput by 40%.</w:t>
+      </w:r>
+    </w:p>
+    <w:p>
+      <w:pPr>
+        <w:pStyle w:val="ListParagraph"/>
+        <w:numPr>
+          <w:ilvl w:val="0"/>
+          <w:numId w:val="2"/>
+        </w:numPr>
+        <w:spacing w:after="15"/>
+      </w:pPr>
+      <w:r>
+        <w:t xml:space="preserve">Implemented engineering metrics and review cadences that improved lead time for changes by 4x and increased visibility for planning and execution.</w:t>
       </w:r>
     </w:p>
     <w:p>
@@ -411,20 +330,20 @@
         <w:spacing w:after="15"/>
       </w:pPr>
       <w:r>
-        <w:t xml:space="preserve">Served as a senior developer on Buy Online, Pick Up In-Store (BOPIS) implementation across five applications and services, reducing hardware-shipping overhead and replacing multi-day mail fulfillment or 2-3 hour in-store onboarding waits with faster pickup workflows.</w:t>
-      </w:r>
-    </w:p>
-    <w:p>
-      <w:pPr>
-        <w:pStyle w:val="ListParagraph"/>
-        <w:numPr>
-          <w:ilvl w:val="0"/>
-          <w:numId w:val="2"/>
-        </w:numPr>
-        <w:spacing w:after="15"/>
-      </w:pPr>
-      <w:r>
-        <w:t xml:space="preserve">Contributed to re-architecture of high-traffic customer-facing systems serving millions of users, reducing critical page latency by 60% and production defects by 75%.</w:t>
+        <w:t xml:space="preserve">Served as a senior developer on Buy Online, Pick Up In-Store implementation across five applications and services, improving customer workflows and reducing reliance on slower fulfillment paths.</w:t>
+      </w:r>
+    </w:p>
+    <w:p>
+      <w:pPr>
+        <w:pStyle w:val="ListParagraph"/>
+        <w:numPr>
+          <w:ilvl w:val="0"/>
+          <w:numId w:val="2"/>
+        </w:numPr>
+        <w:spacing w:after="15"/>
+      </w:pPr>
+      <w:r>
+        <w:t xml:space="preserve">Contributed to the re-architecture of high-traffic customer-facing systems serving millions of users, reducing critical page latency by 60% and production defects by 75%.</w:t>
       </w:r>
     </w:p>
     <w:p>
@@ -438,6 +357,19 @@
       </w:pPr>
       <w:r>
         <w:t xml:space="preserve">Owned billing, consent, and call-center integration workflows tied to revenue and compliance, reducing compliance-related defects by 97% in audited workflows.</w:t>
+      </w:r>
+    </w:p>
+    <w:p>
+      <w:pPr>
+        <w:pStyle w:val="ListParagraph"/>
+        <w:numPr>
+          <w:ilvl w:val="0"/>
+          <w:numId w:val="2"/>
+        </w:numPr>
+        <w:spacing w:after="15"/>
+      </w:pPr>
+      <w:r>
+        <w:t xml:space="preserve">Delivered in a large-scale consumer web environment requiring close coordination across teams, systems, and business stakeholders.</w:t>
       </w:r>
     </w:p>
     <w:p>
@@ -515,7 +447,20 @@
         <w:spacing w:after="15"/>
       </w:pPr>
       <w:r>
-        <w:t xml:space="preserve">Advised clients on platform modernization and scalable architecture strategy, reducing delivery friction and improving long-term maintainability.</w:t>
+        <w:t xml:space="preserve">Advised clients on modernization and scalable architecture strategy, improving maintainability and reducing delivery friction.</w:t>
+      </w:r>
+    </w:p>
+    <w:p>
+      <w:pPr>
+        <w:pStyle w:val="ListParagraph"/>
+        <w:numPr>
+          <w:ilvl w:val="0"/>
+          <w:numId w:val="2"/>
+        </w:numPr>
+        <w:spacing w:after="15"/>
+      </w:pPr>
+      <w:r>
+        <w:t xml:space="preserve">Delivered solutions across varied business contexts, requiring adaptability and close collaboration with stakeholders across product and engineering.</w:t>
       </w:r>
     </w:p>
     <w:p>
@@ -567,7 +512,20 @@
         <w:spacing w:after="15"/>
       </w:pPr>
       <w:r>
-        <w:t xml:space="preserve">Led redesign and re-architecture of Xfinity My Account (approximately 11M monthly users), owning billing and payment journeys representing 80% of self-service traffic.</w:t>
+        <w:t xml:space="preserve">Led redesign and re-architecture of Xfinity My Account, a customer-facing platform serving approximately 11 million monthly users.</w:t>
+      </w:r>
+    </w:p>
+    <w:p>
+      <w:pPr>
+        <w:pStyle w:val="ListParagraph"/>
+        <w:numPr>
+          <w:ilvl w:val="0"/>
+          <w:numId w:val="2"/>
+        </w:numPr>
+        <w:spacing w:after="15"/>
+      </w:pPr>
+      <w:r>
+        <w:t xml:space="preserve">Owned billing and payment journeys representing 80% of self-service traffic within the application.</w:t>
       </w:r>
     </w:p>
     <w:p>
@@ -593,7 +551,7 @@
         <w:spacing w:after="15"/>
       </w:pPr>
       <w:r>
-        <w:t xml:space="preserve">Partnered with product, design, and service architecture leaders to deliver 26 major releases in 19 months while keeping scope churn under 10% through disciplined backlog and release management.</w:t>
+        <w:t xml:space="preserve">Partnered with product, design, and service architecture leaders to deliver 26 major releases in 19 months while controlling scope churn through disciplined backlog and release management.</w:t>
       </w:r>
     </w:p>
     <w:p>
@@ -658,33 +616,33 @@
         <w:spacing w:after="15"/>
       </w:pPr>
       <w:r>
-        <w:t xml:space="preserve">Took a prototype-stage product to market in under six months by stabilizing the codebase and formalizing delivery practices, eliminating critical pre-launch defects in final release cycles.</w:t>
-      </w:r>
-    </w:p>
-    <w:p>
-      <w:pPr>
-        <w:pStyle w:val="ListParagraph"/>
-        <w:numPr>
-          <w:ilvl w:val="0"/>
-          <w:numId w:val="2"/>
-        </w:numPr>
-        <w:spacing w:after="15"/>
-      </w:pPr>
-      <w:r>
-        <w:t xml:space="preserve">Led a mixed team of full-time engineers, contractors, and interns (6 total), delivering 85% of committed roadmap milestones on time while remaining hands-on in priority delivery areas.</w:t>
-      </w:r>
-    </w:p>
-    <w:p>
-      <w:pPr>
-        <w:pStyle w:val="ListParagraph"/>
-        <w:numPr>
-          <w:ilvl w:val="0"/>
-          <w:numId w:val="2"/>
-        </w:numPr>
-        <w:spacing w:after="15"/>
-      </w:pPr>
-      <w:r>
-        <w:t xml:space="preserve">Drove targeted feature delivery, performance tuning, and platform hardening that supported 560% user growth while building net-new product capabilities from the ground up.</w:t>
+        <w:t xml:space="preserve">Took a prototype-stage product to market in under six months by stabilizing the codebase and formalizing delivery practices.</w:t>
+      </w:r>
+    </w:p>
+    <w:p>
+      <w:pPr>
+        <w:pStyle w:val="ListParagraph"/>
+        <w:numPr>
+          <w:ilvl w:val="0"/>
+          <w:numId w:val="2"/>
+        </w:numPr>
+        <w:spacing w:after="15"/>
+      </w:pPr>
+      <w:r>
+        <w:t xml:space="preserve">Led a mixed team of engineers, contractors, and interns while remaining hands-on in priority delivery areas.</w:t>
+      </w:r>
+    </w:p>
+    <w:p>
+      <w:pPr>
+        <w:pStyle w:val="ListParagraph"/>
+        <w:numPr>
+          <w:ilvl w:val="0"/>
+          <w:numId w:val="2"/>
+        </w:numPr>
+        <w:spacing w:after="15"/>
+      </w:pPr>
+      <w:r>
+        <w:t xml:space="preserve">Drove feature delivery, performance tuning, and platform hardening that supported 560% user growth while adding new product capabilities.</w:t>
       </w:r>
     </w:p>
     <w:p>
@@ -736,20 +694,46 @@
         <w:spacing w:after="15"/>
       </w:pPr>
       <w:r>
-        <w:t xml:space="preserve">Served as technical lead on multidisciplinary teams delivering custom enterprise solutions across 3 concurrent client engagements.</w:t>
-      </w:r>
-    </w:p>
-    <w:p>
-      <w:pPr>
-        <w:pStyle w:val="ListParagraph"/>
-        <w:numPr>
-          <w:ilvl w:val="0"/>
-          <w:numId w:val="2"/>
-        </w:numPr>
-        <w:spacing w:after="15"/>
-      </w:pPr>
-      <w:r>
-        <w:t xml:space="preserve">Partnered with principals and engagement leads on architecture, planning, and client strategy to improve delivery predictability and reduce rework across engagements.</w:t>
+        <w:t xml:space="preserve">Served as technical lead on multidisciplinary teams delivering custom enterprise solutions across three concurrent client engagements.</w:t>
+      </w:r>
+    </w:p>
+    <w:p>
+      <w:pPr>
+        <w:pStyle w:val="ListParagraph"/>
+        <w:numPr>
+          <w:ilvl w:val="0"/>
+          <w:numId w:val="2"/>
+        </w:numPr>
+        <w:spacing w:after="15"/>
+      </w:pPr>
+      <w:r>
+        <w:t xml:space="preserve">Led UI architecture and technical planning efforts in partnership with principals and engagement leads.</w:t>
+      </w:r>
+    </w:p>
+    <w:p>
+      <w:pPr>
+        <w:pStyle w:val="ListParagraph"/>
+        <w:numPr>
+          <w:ilvl w:val="0"/>
+          <w:numId w:val="2"/>
+        </w:numPr>
+        <w:spacing w:after="15"/>
+      </w:pPr>
+      <w:r>
+        <w:t xml:space="preserve">Improved delivery predictability and reduced rework through stronger architecture, planning, and client strategy alignment.</w:t>
+      </w:r>
+    </w:p>
+    <w:p>
+      <w:pPr>
+        <w:pStyle w:val="ListParagraph"/>
+        <w:numPr>
+          <w:ilvl w:val="0"/>
+          <w:numId w:val="2"/>
+        </w:numPr>
+        <w:spacing w:after="15"/>
+      </w:pPr>
+      <w:r>
+        <w:t xml:space="preserve">Worked closely with cross-functional teams in design-heavy consulting engagements where front-end quality and collaboration were central to success.</w:t>
       </w:r>
     </w:p>
     <w:p>
@@ -790,20 +774,20 @@
         <w:spacing w:after="15"/>
       </w:pPr>
       <w:r>
-        <w:t xml:space="preserve">Several years as an independent contractor delivering 25+ web and systems engineering projects across industries, with 90% repeat-client business across retained accounts and 95% on-time delivery.</w:t>
-      </w:r>
-    </w:p>
-    <w:p>
-      <w:pPr>
-        <w:pStyle w:val="ListParagraph"/>
-        <w:numPr>
-          <w:ilvl w:val="0"/>
-          <w:numId w:val="2"/>
-        </w:numPr>
-        <w:spacing w:after="15"/>
-      </w:pPr>
-      <w:r>
-        <w:t xml:space="preserve">As UI Developer at cPanel, contributed to a major interface overhaul used by millions of end users, improving usability metrics (for example, task completion/time-to-complete) by 80%.</w:t>
+        <w:t xml:space="preserve">Delivered 25+ web and systems engineering projects as an independent contractor across multiple industries, with 90% repeat-client business and 95% on-time delivery.</w:t>
+      </w:r>
+    </w:p>
+    <w:p>
+      <w:pPr>
+        <w:pStyle w:val="ListParagraph"/>
+        <w:numPr>
+          <w:ilvl w:val="0"/>
+          <w:numId w:val="2"/>
+        </w:numPr>
+        <w:spacing w:after="15"/>
+      </w:pPr>
+      <w:r>
+        <w:t xml:space="preserve">As a UI Developer at cPanel, contributed to a major interface overhaul used by millions of end users, improving usability metrics such as task completion and time-to-complete by 80%.</w:t>
       </w:r>
     </w:p>
     <w:p>
@@ -817,90 +801,6 @@
       </w:pPr>
       <w:r>
         <w:t xml:space="preserve">As Director of IT at Exam Master Corporation, led infrastructure modernization and platform redevelopment as greenfield initiatives that established scalable foundations for future reliability and support operations.</w:t>
-      </w:r>
-    </w:p>
-    <w:p>
-      <w:pPr>
-        <w:pStyle w:val="Heading2"/>
-        <w:spacing w:after="80" w:before="60"/>
-      </w:pPr>
-      <w:r>
-        <w:t xml:space="preserve">TECHNICAL</w:t>
-      </w:r>
-    </w:p>
-    <w:p>
-      <w:pPr>
-        <w:spacing w:after="35"/>
-      </w:pPr>
-      <w:r>
-        <w:rPr>
-          <w:b/>
-          <w:bCs/>
-        </w:rPr>
-        <w:t xml:space="preserve">Languages: </w:t>
-      </w:r>
-      <w:r>
-        <w:t xml:space="preserve">JavaScript, SQL, Ruby, .NET, PHP, HTML, CSS</w:t>
-      </w:r>
-    </w:p>
-    <w:p>
-      <w:pPr>
-        <w:spacing w:after="35"/>
-      </w:pPr>
-      <w:r>
-        <w:rPr>
-          <w:b/>
-          <w:bCs/>
-        </w:rPr>
-        <w:t xml:space="preserve">Frameworks: </w:t>
-      </w:r>
-      <w:r>
-        <w:t xml:space="preserve">React, AngularJS, Node.js, Ruby on Rails</w:t>
-      </w:r>
-    </w:p>
-    <w:p>
-      <w:pPr>
-        <w:spacing w:after="35"/>
-      </w:pPr>
-      <w:r>
-        <w:rPr>
-          <w:b/>
-          <w:bCs/>
-        </w:rPr>
-        <w:t xml:space="preserve">Cloud &amp; Infrastructure: </w:t>
-      </w:r>
-      <w:r>
-        <w:t xml:space="preserve">AWS, Heroku, DigitalOcean, Linux</w:t>
-      </w:r>
-    </w:p>
-    <w:p>
-      <w:pPr>
-        <w:spacing w:after="35"/>
-      </w:pPr>
-      <w:r>
-        <w:rPr>
-          <w:b/>
-          <w:bCs/>
-        </w:rPr>
-        <w:t xml:space="preserve">CI/CD: </w:t>
-      </w:r>
-      <w:r>
-        <w:t xml:space="preserve">Jenkins, CircleCI, Azure DevOps</w:t>
-      </w:r>
-    </w:p>
-    <w:p>
-      <w:pPr>
-        <w:spacing w:after="35"/>
-      </w:pPr>
-      <w:r>
-        <w:rPr>
-          <w:b/>
-          <w:bCs/>
-        </w:rPr>
-        <w:t xml:space="preserve">Practices: </w:t>
-      </w:r>
-      <w:r>
-        <w:t xml:space="preserve">Agile delivery, DevOps, DORA metrics, platform engineering</w:t>
       </w:r>
     </w:p>
     <w:sectPr>

</xml_diff>

<commit_message>
Switch resume email to joseph.bader@gmail.com and regenerate documents
Co-Authored-By: Claude Fable 5 <noreply@anthropic.com>
</commit_message>
<xml_diff>
--- a/resume/resume.docx
+++ b/resume/resume.docx
@@ -16,7 +16,7 @@
         <w:spacing w:after="60"/>
       </w:pPr>
       <w:r>
-        <w:t xml:space="preserve">Web Application Development, Technical Leadership</w:t>
+        <w:t xml:space="preserve">Software Engineering Leadership, Conversational AI, Web Application Development</w:t>
       </w:r>
     </w:p>
     <w:p>
@@ -30,7 +30,7 @@
         <w:rPr>
           <w:color w:val="12456E"/>
         </w:rPr>
-        <w:t xml:space="preserve">Philadelphia, PA 19129 | joe@joebader.com | joebader.com | linkedin.com/in/josephbader</w:t>
+        <w:t xml:space="preserve">Philadelphia, PA 19129 | joseph.bader@gmail.com | joebader.com | linkedin.com/in/josephbader</w:t>
       </w:r>
     </w:p>
     <w:p>
@@ -47,7 +47,7 @@
         <w:spacing w:after="180"/>
       </w:pPr>
       <w:r>
-        <w:t xml:space="preserve">Software engineering leader with 20+ years building customer-facing web applications across enterprise, SaaS, consulting, and startup environments. Hands-on experience delivering responsive web platforms, leading UI architecture, and modernizing high-traffic digital experiences used by millions of users. Background includes React, AngularJS, JavaScript, HTML, and CSS, with experience spanning UI redesign, front-end modernization, and cross-functional delivery across product, design, and engineering teams. Proven record improving usability, performance, and delivery outcomes while helping teams plan and execute complex work in agile environments.</w:t>
+        <w:t xml:space="preserve">Software engineering leader with 20+ years building customer-facing web platforms across enterprise, SaaS, consulting, and startup environments — including four years leading high-traffic digital sales and account-management initiatives at Comcast used by millions of customers. Currently founder of an AI SaaS built around a conversational LLM assistant with tool calling and nightly automated model evaluation. Proven record leading and mentoring cross-functional engineering teams, implementing delivery metrics that improve predictability, scaling AI-assisted development practices, and staying hands-on with architecture in agile environments.</w:t>
       </w:r>
     </w:p>
     <w:p>
@@ -71,7 +71,7 @@
         <w:t xml:space="preserve">Languages: </w:t>
       </w:r>
       <w:r>
-        <w:t xml:space="preserve">JavaScript, SQL, Ruby, .NET, PHP, HTML, CSS</w:t>
+        <w:t xml:space="preserve">TypeScript, JavaScript, SQL, Ruby, .NET, PHP, HTML, CSS</w:t>
       </w:r>
     </w:p>
     <w:p>
@@ -116,7 +116,7 @@
         <w:t xml:space="preserve">CI/CD: </w:t>
       </w:r>
       <w:r>
-        <w:t xml:space="preserve">Jenkins, CircleCI, Azure DevOps</w:t>
+        <w:t xml:space="preserve">GitHub Actions, Jenkins, CircleCI, Azure DevOps</w:t>
       </w:r>
     </w:p>
     <w:p>
@@ -131,7 +131,7 @@
         <w:t xml:space="preserve">Practices: </w:t>
       </w:r>
       <w:r>
-        <w:t xml:space="preserve">Agile delivery, architecture stewardship, platform modernization, DevOps, DORA metrics</w:t>
+        <w:t xml:space="preserve">Conversational AI &amp; LLM integration (tool calling, model evaluation), agentic AI development, agile delivery, architecture stewardship, platform modernization, DevOps, DORA metrics</w:t>
       </w:r>
     </w:p>
     <w:p>
@@ -155,7 +155,7 @@
           <w:b/>
           <w:bCs/>
         </w:rPr>
-        <w:t xml:space="preserve">Senior Manager, Software Engineering</w:t>
+        <w:t xml:space="preserve">Founder &amp; Principal Engineer</w:t>
       </w:r>
       <w:r>
         <w:rPr>
@@ -163,7 +163,7 @@
           <w:iCs/>
           <w:color w:val="4B5A6A"/>
         </w:rPr>
-        <w:t xml:space="preserve">	12/2021 - 12/2025</w:t>
+        <w:t xml:space="preserve">	07/2025 - Present</w:t>
       </w:r>
     </w:p>
     <w:p>
@@ -174,98 +174,85 @@
         <w:rPr>
           <w:color w:val="4B5A6A"/>
         </w:rPr>
-        <w:t xml:space="preserve">Riskonnect | Remote</w:t>
-      </w:r>
-    </w:p>
-    <w:p>
-      <w:pPr>
-        <w:pStyle w:val="ListParagraph"/>
-        <w:numPr>
-          <w:ilvl w:val="0"/>
-          <w:numId w:val="2"/>
-        </w:numPr>
-        <w:spacing w:after="15"/>
-      </w:pPr>
-      <w:r>
-        <w:t xml:space="preserve">Led five cross-functional engineering teams (5–8 people each) supporting a core B2B SaaS platform, improving on-time delivery from 30% to 95% while meeting reliability targets.</w:t>
-      </w:r>
-    </w:p>
-    <w:p>
-      <w:pPr>
-        <w:pStyle w:val="ListParagraph"/>
-        <w:numPr>
-          <w:ilvl w:val="0"/>
-          <w:numId w:val="2"/>
-        </w:numPr>
-        <w:spacing w:after="15"/>
-      </w:pPr>
-      <w:r>
-        <w:t xml:space="preserve">Led a major UI modernization effort using agentic AI to migrate a legacy Bootstrap interface to the latest version, including inventorying, planning, and updating thousands of UI files.</w:t>
-      </w:r>
-    </w:p>
-    <w:p>
-      <w:pPr>
-        <w:pStyle w:val="ListParagraph"/>
-        <w:numPr>
-          <w:ilvl w:val="0"/>
-          <w:numId w:val="2"/>
-        </w:numPr>
-        <w:spacing w:after="15"/>
-      </w:pPr>
-      <w:r>
-        <w:t xml:space="preserve">Drove front-end modernization within a large existing product environment, balancing large-scale change with continuity for an established user experience.</w:t>
-      </w:r>
-    </w:p>
-    <w:p>
-      <w:pPr>
-        <w:pStyle w:val="ListParagraph"/>
-        <w:numPr>
-          <w:ilvl w:val="0"/>
-          <w:numId w:val="2"/>
-        </w:numPr>
-        <w:spacing w:after="15"/>
-      </w:pPr>
-      <w:r>
-        <w:t xml:space="preserve">Served as senior architecture reviewer for high-impact initiatives, helping teams identify weak design approaches before implementation and reducing long-term platform risk.</w:t>
-      </w:r>
-    </w:p>
-    <w:p>
-      <w:pPr>
-        <w:pStyle w:val="ListParagraph"/>
-        <w:numPr>
-          <w:ilvl w:val="0"/>
-          <w:numId w:val="2"/>
-        </w:numPr>
-        <w:spacing w:after="15"/>
-      </w:pPr>
-      <w:r>
-        <w:t xml:space="preserve">Partnered with product and engineering leadership to sequence multi-quarter initiatives, improving roadmap predictability and strengthening delivery confidence.</w:t>
-      </w:r>
-    </w:p>
-    <w:p>
-      <w:pPr>
-        <w:pStyle w:val="ListParagraph"/>
-        <w:numPr>
-          <w:ilvl w:val="0"/>
-          <w:numId w:val="2"/>
-        </w:numPr>
-        <w:spacing w:after="15"/>
-      </w:pPr>
-      <w:r>
-        <w:t xml:space="preserve">Scaled AI-assisted development practices across five teams, increasing pull request throughput by 40%.</w:t>
-      </w:r>
-    </w:p>
-    <w:p>
-      <w:pPr>
-        <w:pStyle w:val="ListParagraph"/>
-        <w:numPr>
-          <w:ilvl w:val="0"/>
-          <w:numId w:val="2"/>
-        </w:numPr>
-        <w:spacing w:after="15"/>
-      </w:pPr>
-      <w:r>
-        <w:t xml:space="preserve">Implemented engineering metrics and review cadences that improved lead time for changes by 4x and increased visibility for planning and execution.</w:t>
+        <w:t xml:space="preserve">Tuner Logic (tunerlogic.com) | Remote</w:t>
+      </w:r>
+    </w:p>
+    <w:p>
+      <w:pPr>
+        <w:pStyle w:val="ListParagraph"/>
+        <w:numPr>
+          <w:ilvl w:val="0"/>
+          <w:numId w:val="2"/>
+        </w:numPr>
+        <w:spacing w:after="15"/>
+      </w:pPr>
+      <w:r>
+        <w:t xml:space="preserve">Founded and launched Tuner Logic, a browser-based AI-assisted engine tuning SaaS for independent tuners and performance shops; sole architect from concept through public launch, shipping ~1,000 commits across 350+ pull requests in the first year.</w:t>
+      </w:r>
+    </w:p>
+    <w:p>
+      <w:pPr>
+        <w:pStyle w:val="ListParagraph"/>
+        <w:numPr>
+          <w:ilvl w:val="0"/>
+          <w:numId w:val="2"/>
+        </w:numPr>
+        <w:spacing w:after="15"/>
+      </w:pPr>
+      <w:r>
+        <w:t xml:space="preserve">Designed a conversational AI co-tuner — an LLM assistant with function calling grounded in live telemetry and calibration data — with server-side provider proxying (Anthropic, OpenAI), usage-metered credit billing via Stripe, and nightly automated model evaluations.</w:t>
+      </w:r>
+    </w:p>
+    <w:p>
+      <w:pPr>
+        <w:pStyle w:val="ListParagraph"/>
+        <w:numPr>
+          <w:ilvl w:val="0"/>
+          <w:numId w:val="2"/>
+        </w:numPr>
+        <w:spacing w:after="15"/>
+      </w:pPr>
+      <w:r>
+        <w:t xml:space="preserve">Architected the full stack — React 18/TypeScript front end, Cloudflare Workers backend (Hono, Drizzle, D1, R2) — including an ECU-agnostic ROM editor with 2D/3D table views and revision diffs, plus a multi-channel datalog analysis engine.</w:t>
+      </w:r>
+    </w:p>
+    <w:p>
+      <w:pPr>
+        <w:pStyle w:val="ListParagraph"/>
+        <w:numPr>
+          <w:ilvl w:val="0"/>
+          <w:numId w:val="2"/>
+        </w:numPr>
+        <w:spacing w:after="15"/>
+      </w:pPr>
+      <w:r>
+        <w:t xml:space="preserve">Applied ISO 26262-inspired safety practices: per-component ASIL classifications driving ratcheting test-coverage gates toward 100% across unit, integration, and E2E suites.</w:t>
+      </w:r>
+    </w:p>
+    <w:p>
+      <w:pPr>
+        <w:pStyle w:val="ListParagraph"/>
+        <w:numPr>
+          <w:ilvl w:val="0"/>
+          <w:numId w:val="2"/>
+        </w:numPr>
+        <w:spacing w:after="15"/>
+      </w:pPr>
+      <w:r>
+        <w:t xml:space="preserve">Built continuous delivery on GitHub Actions and Cloudflare: per-PR preview environments with automated provisioning and cleanup, sharded Playwright E2E with merged coverage enforcement, and recurring security audits.</w:t>
+      </w:r>
+    </w:p>
+    <w:p>
+      <w:pPr>
+        <w:pStyle w:val="ListParagraph"/>
+        <w:numPr>
+          <w:ilvl w:val="0"/>
+          <w:numId w:val="2"/>
+        </w:numPr>
+        <w:spacing w:after="15"/>
+      </w:pPr>
+      <w:r>
+        <w:t xml:space="preserve">Engineered a multi-agent AI development platform — coding agents orchestrated across isolated git worktrees on self-hosted runners, with an AI code reviewer as a required merge gate — sustaining multi-team throughput solo.</w:t>
       </w:r>
     </w:p>
     <w:p>
@@ -285,7 +272,7 @@
           <w:b/>
           <w:bCs/>
         </w:rPr>
-        <w:t xml:space="preserve">Lead Software Engineer (Contract)</w:t>
+        <w:t xml:space="preserve">Senior Manager, Software Engineering</w:t>
       </w:r>
       <w:r>
         <w:rPr>
@@ -293,7 +280,7 @@
           <w:iCs/>
           <w:color w:val="4B5A6A"/>
         </w:rPr>
-        <w:t xml:space="preserve">	10/2018 - 07/2021</w:t>
+        <w:t xml:space="preserve">	12/2021 - 12/2025</w:t>
       </w:r>
     </w:p>
     <w:p>
@@ -304,72 +291,85 @@
         <w:rPr>
           <w:color w:val="4B5A6A"/>
         </w:rPr>
-        <w:t xml:space="preserve">Comcast (via TEKsystems) | Philadelphia, PA</w:t>
-      </w:r>
-    </w:p>
-    <w:p>
-      <w:pPr>
-        <w:pStyle w:val="ListParagraph"/>
-        <w:numPr>
-          <w:ilvl w:val="0"/>
-          <w:numId w:val="2"/>
-        </w:numPr>
-        <w:spacing w:after="15"/>
-      </w:pPr>
-      <w:r>
-        <w:t xml:space="preserve">Led engineering for four high-visibility initiatives across Comcast's digital sales and account management platforms, delivering releases within 95% of planned timeline targets.</w:t>
-      </w:r>
-    </w:p>
-    <w:p>
-      <w:pPr>
-        <w:pStyle w:val="ListParagraph"/>
-        <w:numPr>
-          <w:ilvl w:val="0"/>
-          <w:numId w:val="2"/>
-        </w:numPr>
-        <w:spacing w:after="15"/>
-      </w:pPr>
-      <w:r>
-        <w:t xml:space="preserve">Served as a senior developer on Buy Online, Pick Up In-Store implementation across five applications and services, improving customer workflows and reducing reliance on slower fulfillment paths.</w:t>
-      </w:r>
-    </w:p>
-    <w:p>
-      <w:pPr>
-        <w:pStyle w:val="ListParagraph"/>
-        <w:numPr>
-          <w:ilvl w:val="0"/>
-          <w:numId w:val="2"/>
-        </w:numPr>
-        <w:spacing w:after="15"/>
-      </w:pPr>
-      <w:r>
-        <w:t xml:space="preserve">Contributed to the re-architecture of high-traffic customer-facing systems serving millions of users, reducing critical page latency by 60% and production defects by 75%.</w:t>
-      </w:r>
-    </w:p>
-    <w:p>
-      <w:pPr>
-        <w:pStyle w:val="ListParagraph"/>
-        <w:numPr>
-          <w:ilvl w:val="0"/>
-          <w:numId w:val="2"/>
-        </w:numPr>
-        <w:spacing w:after="15"/>
-      </w:pPr>
-      <w:r>
-        <w:t xml:space="preserve">Owned billing, consent, and call-center integration workflows tied to revenue and compliance, reducing compliance-related defects by 97% in audited workflows.</w:t>
-      </w:r>
-    </w:p>
-    <w:p>
-      <w:pPr>
-        <w:pStyle w:val="ListParagraph"/>
-        <w:numPr>
-          <w:ilvl w:val="0"/>
-          <w:numId w:val="2"/>
-        </w:numPr>
-        <w:spacing w:after="15"/>
-      </w:pPr>
-      <w:r>
-        <w:t xml:space="preserve">Delivered in a large-scale consumer web environment requiring close coordination across teams, systems, and business stakeholders.</w:t>
+        <w:t xml:space="preserve">Riskonnect | Remote</w:t>
+      </w:r>
+    </w:p>
+    <w:p>
+      <w:pPr>
+        <w:pStyle w:val="ListParagraph"/>
+        <w:numPr>
+          <w:ilvl w:val="0"/>
+          <w:numId w:val="2"/>
+        </w:numPr>
+        <w:spacing w:after="15"/>
+      </w:pPr>
+      <w:r>
+        <w:t xml:space="preserve">Led and mentored five cross-functional engineering teams (5–8 engineers each) supporting a core B2B SaaS platform, improving on-time delivery from 30% to 95% while meeting reliability targets.</w:t>
+      </w:r>
+    </w:p>
+    <w:p>
+      <w:pPr>
+        <w:pStyle w:val="ListParagraph"/>
+        <w:numPr>
+          <w:ilvl w:val="0"/>
+          <w:numId w:val="2"/>
+        </w:numPr>
+        <w:spacing w:after="15"/>
+      </w:pPr>
+      <w:r>
+        <w:t xml:space="preserve">Led a major UI modernization effort using agentic AI to migrate a legacy Bootstrap interface to the latest version, including inventorying, planning, and updating thousands of UI files.</w:t>
+      </w:r>
+    </w:p>
+    <w:p>
+      <w:pPr>
+        <w:pStyle w:val="ListParagraph"/>
+        <w:numPr>
+          <w:ilvl w:val="0"/>
+          <w:numId w:val="2"/>
+        </w:numPr>
+        <w:spacing w:after="15"/>
+      </w:pPr>
+      <w:r>
+        <w:t xml:space="preserve">Served as senior architecture reviewer for high-impact initiatives, helping teams identify weak design approaches before implementation and reducing long-term platform risk.</w:t>
+      </w:r>
+    </w:p>
+    <w:p>
+      <w:pPr>
+        <w:pStyle w:val="ListParagraph"/>
+        <w:numPr>
+          <w:ilvl w:val="0"/>
+          <w:numId w:val="2"/>
+        </w:numPr>
+        <w:spacing w:after="15"/>
+      </w:pPr>
+      <w:r>
+        <w:t xml:space="preserve">Scaled AI-assisted development practices across five teams, increasing pull request throughput by 40%.</w:t>
+      </w:r>
+    </w:p>
+    <w:p>
+      <w:pPr>
+        <w:pStyle w:val="ListParagraph"/>
+        <w:numPr>
+          <w:ilvl w:val="0"/>
+          <w:numId w:val="2"/>
+        </w:numPr>
+        <w:spacing w:after="15"/>
+      </w:pPr>
+      <w:r>
+        <w:t xml:space="preserve">Partnered with product and engineering leadership to sequence multi-quarter initiatives and manage stakeholder communications, improving roadmap predictability.</w:t>
+      </w:r>
+    </w:p>
+    <w:p>
+      <w:pPr>
+        <w:pStyle w:val="ListParagraph"/>
+        <w:numPr>
+          <w:ilvl w:val="0"/>
+          <w:numId w:val="2"/>
+        </w:numPr>
+        <w:spacing w:after="15"/>
+      </w:pPr>
+      <w:r>
+        <w:t xml:space="preserve">Implemented engineering metrics and review cadences that improved lead time for changes by 4x and increased visibility for planning and execution.</w:t>
       </w:r>
     </w:p>
     <w:p>
@@ -389,7 +389,7 @@
           <w:b/>
           <w:bCs/>
         </w:rPr>
-        <w:t xml:space="preserve">Founder, Managing Partner, and Technology Principal</w:t>
+        <w:t xml:space="preserve">Lead Software Engineer (Contract)</w:t>
       </w:r>
       <w:r>
         <w:rPr>
@@ -397,7 +397,7 @@
           <w:iCs/>
           <w:color w:val="4B5A6A"/>
         </w:rPr>
-        <w:t xml:space="preserve">	10/2017 - 10/2018</w:t>
+        <w:t xml:space="preserve">	10/2018 - 07/2021</w:t>
       </w:r>
     </w:p>
     <w:p>
@@ -408,59 +408,59 @@
         <w:rPr>
           <w:color w:val="4B5A6A"/>
         </w:rPr>
-        <w:t xml:space="preserve">5 Foot Gorilla, LLC | Philadelphia, PA / Remote</w:t>
-      </w:r>
-    </w:p>
-    <w:p>
-      <w:pPr>
-        <w:pStyle w:val="ListParagraph"/>
-        <w:numPr>
-          <w:ilvl w:val="0"/>
-          <w:numId w:val="2"/>
-        </w:numPr>
-        <w:spacing w:after="15"/>
-      </w:pPr>
-      <w:r>
-        <w:t xml:space="preserve">Built and led a technology consulting firm delivering custom SaaS, web, and mobile solutions from discovery through production launch.</w:t>
-      </w:r>
-    </w:p>
-    <w:p>
-      <w:pPr>
-        <w:pStyle w:val="ListParagraph"/>
-        <w:numPr>
-          <w:ilvl w:val="0"/>
-          <w:numId w:val="2"/>
-        </w:numPr>
-        <w:spacing w:after="15"/>
-      </w:pPr>
-      <w:r>
-        <w:t xml:space="preserve">Owned technical execution, solution architecture, sales scoping, and delivery governance across client engagements, aligning outcomes to business goals, budgets, and timelines.</w:t>
-      </w:r>
-    </w:p>
-    <w:p>
-      <w:pPr>
-        <w:pStyle w:val="ListParagraph"/>
-        <w:numPr>
-          <w:ilvl w:val="0"/>
-          <w:numId w:val="2"/>
-        </w:numPr>
-        <w:spacing w:after="15"/>
-      </w:pPr>
-      <w:r>
-        <w:t xml:space="preserve">Advised clients on modernization and scalable architecture strategy, improving maintainability and reducing delivery friction.</w:t>
-      </w:r>
-    </w:p>
-    <w:p>
-      <w:pPr>
-        <w:pStyle w:val="ListParagraph"/>
-        <w:numPr>
-          <w:ilvl w:val="0"/>
-          <w:numId w:val="2"/>
-        </w:numPr>
-        <w:spacing w:after="15"/>
-      </w:pPr>
-      <w:r>
-        <w:t xml:space="preserve">Delivered solutions across varied business contexts, requiring adaptability and close collaboration with stakeholders across product and engineering.</w:t>
+        <w:t xml:space="preserve">Comcast (via TEKsystems) | Philadelphia, PA</w:t>
+      </w:r>
+    </w:p>
+    <w:p>
+      <w:pPr>
+        <w:pStyle w:val="ListParagraph"/>
+        <w:numPr>
+          <w:ilvl w:val="0"/>
+          <w:numId w:val="2"/>
+        </w:numPr>
+        <w:spacing w:after="15"/>
+      </w:pPr>
+      <w:r>
+        <w:t xml:space="preserve">Led engineering for four high-visibility initiatives across Comcast's digital sales and account management platforms.</w:t>
+      </w:r>
+    </w:p>
+    <w:p>
+      <w:pPr>
+        <w:pStyle w:val="ListParagraph"/>
+        <w:numPr>
+          <w:ilvl w:val="0"/>
+          <w:numId w:val="2"/>
+        </w:numPr>
+        <w:spacing w:after="15"/>
+      </w:pPr>
+      <w:r>
+        <w:t xml:space="preserve">Served as a senior developer on Buy Online, Pick Up In-Store implementation across five applications and services, improving customer workflows and reducing reliance on slower fulfillment paths.</w:t>
+      </w:r>
+    </w:p>
+    <w:p>
+      <w:pPr>
+        <w:pStyle w:val="ListParagraph"/>
+        <w:numPr>
+          <w:ilvl w:val="0"/>
+          <w:numId w:val="2"/>
+        </w:numPr>
+        <w:spacing w:after="15"/>
+      </w:pPr>
+      <w:r>
+        <w:t xml:space="preserve">Contributed to the re-architecture of high-traffic customer-facing systems serving millions of users, reducing critical page latency and production defect rates.</w:t>
+      </w:r>
+    </w:p>
+    <w:p>
+      <w:pPr>
+        <w:pStyle w:val="ListParagraph"/>
+        <w:numPr>
+          <w:ilvl w:val="0"/>
+          <w:numId w:val="2"/>
+        </w:numPr>
+        <w:spacing w:after="15"/>
+      </w:pPr>
+      <w:r>
+        <w:t xml:space="preserve">Owned billing, consent, and call-center integration workflows tied to revenue and compliance, hardening audited workflows against compliance defects.</w:t>
       </w:r>
     </w:p>
     <w:p>
@@ -480,7 +480,7 @@
           <w:b/>
           <w:bCs/>
         </w:rPr>
-        <w:t xml:space="preserve">Principal Software Engineer / Development Manager (Contract)</w:t>
+        <w:t xml:space="preserve">Founder, Managing Partner, and Technology Principal</w:t>
       </w:r>
       <w:r>
         <w:rPr>
@@ -488,7 +488,7 @@
           <w:iCs/>
           <w:color w:val="4B5A6A"/>
         </w:rPr>
-        <w:t xml:space="preserve">	02/2016 - 09/2017</w:t>
+        <w:t xml:space="preserve">	10/2017 - 10/2018</w:t>
       </w:r>
     </w:p>
     <w:p>
@@ -499,72 +499,33 @@
         <w:rPr>
           <w:color w:val="4B5A6A"/>
         </w:rPr>
-        <w:t xml:space="preserve">Comcast (via FIS Global / Yoh) | Philadelphia, PA</w:t>
-      </w:r>
-    </w:p>
-    <w:p>
-      <w:pPr>
-        <w:pStyle w:val="ListParagraph"/>
-        <w:numPr>
-          <w:ilvl w:val="0"/>
-          <w:numId w:val="2"/>
-        </w:numPr>
-        <w:spacing w:after="15"/>
-      </w:pPr>
-      <w:r>
-        <w:t xml:space="preserve">Led redesign and re-architecture of Xfinity My Account, a customer-facing platform serving approximately 11 million monthly users.</w:t>
-      </w:r>
-    </w:p>
-    <w:p>
-      <w:pPr>
-        <w:pStyle w:val="ListParagraph"/>
-        <w:numPr>
-          <w:ilvl w:val="0"/>
-          <w:numId w:val="2"/>
-        </w:numPr>
-        <w:spacing w:after="15"/>
-      </w:pPr>
-      <w:r>
-        <w:t xml:space="preserve">Owned billing and payment journeys representing 80% of self-service traffic within the application.</w:t>
-      </w:r>
-    </w:p>
-    <w:p>
-      <w:pPr>
-        <w:pStyle w:val="ListParagraph"/>
-        <w:numPr>
-          <w:ilvl w:val="0"/>
-          <w:numId w:val="2"/>
-        </w:numPr>
-        <w:spacing w:after="15"/>
-      </w:pPr>
-      <w:r>
-        <w:t xml:space="preserve">Received the Creativity International Gold Award for Web Redesign as part of the Xfinity My Account redesign program.</w:t>
-      </w:r>
-    </w:p>
-    <w:p>
-      <w:pPr>
-        <w:pStyle w:val="ListParagraph"/>
-        <w:numPr>
-          <w:ilvl w:val="0"/>
-          <w:numId w:val="2"/>
-        </w:numPr>
-        <w:spacing w:after="15"/>
-      </w:pPr>
-      <w:r>
-        <w:t xml:space="preserve">Partnered with product, design, and service architecture leaders to deliver 26 major releases in 19 months while controlling scope churn through disciplined backlog and release management.</w:t>
-      </w:r>
-    </w:p>
-    <w:p>
-      <w:pPr>
-        <w:pStyle w:val="ListParagraph"/>
-        <w:numPr>
-          <w:ilvl w:val="0"/>
-          <w:numId w:val="2"/>
-        </w:numPr>
-        <w:spacing w:after="15"/>
-      </w:pPr>
-      <w:r>
-        <w:t xml:space="preserve">Delivered the program eight weeks ahead of schedule and 20% under budget, reducing average session duration by 40% and increasing successful bill payment rates by 80%.</w:t>
+        <w:t xml:space="preserve">5 Foot Gorilla, LLC | Philadelphia, PA / Remote</w:t>
+      </w:r>
+    </w:p>
+    <w:p>
+      <w:pPr>
+        <w:pStyle w:val="ListParagraph"/>
+        <w:numPr>
+          <w:ilvl w:val="0"/>
+          <w:numId w:val="2"/>
+        </w:numPr>
+        <w:spacing w:after="15"/>
+      </w:pPr>
+      <w:r>
+        <w:t xml:space="preserve">Built and led a technology consulting firm delivering custom SaaS, web, and mobile solutions from discovery through production launch.</w:t>
+      </w:r>
+    </w:p>
+    <w:p>
+      <w:pPr>
+        <w:pStyle w:val="ListParagraph"/>
+        <w:numPr>
+          <w:ilvl w:val="0"/>
+          <w:numId w:val="2"/>
+        </w:numPr>
+        <w:spacing w:after="15"/>
+      </w:pPr>
+      <w:r>
+        <w:t xml:space="preserve">Owned solution architecture, technical execution, sales scoping, and delivery governance across client engagements, advising clients on modernization and scalable architecture strategy.</w:t>
       </w:r>
     </w:p>
     <w:p>
@@ -584,7 +545,7 @@
           <w:b/>
           <w:bCs/>
         </w:rPr>
-        <w:t xml:space="preserve">Chief Product Officer</w:t>
+        <w:t xml:space="preserve">Principal Software Engineer / Development Manager (Contract)</w:t>
       </w:r>
       <w:r>
         <w:rPr>
@@ -592,7 +553,7 @@
           <w:iCs/>
           <w:color w:val="4B5A6A"/>
         </w:rPr>
-        <w:t xml:space="preserve">	05/2015 - 02/2016</w:t>
+        <w:t xml:space="preserve">	02/2016 - 09/2017</w:t>
       </w:r>
     </w:p>
     <w:p>
@@ -603,46 +564,59 @@
         <w:rPr>
           <w:color w:val="4B5A6A"/>
         </w:rPr>
-        <w:t xml:space="preserve">Cnverg | Philadelphia, PA</w:t>
-      </w:r>
-    </w:p>
-    <w:p>
-      <w:pPr>
-        <w:pStyle w:val="ListParagraph"/>
-        <w:numPr>
-          <w:ilvl w:val="0"/>
-          <w:numId w:val="2"/>
-        </w:numPr>
-        <w:spacing w:after="15"/>
-      </w:pPr>
-      <w:r>
-        <w:t xml:space="preserve">Took a prototype-stage product to market in under six months by stabilizing the codebase and formalizing delivery practices.</w:t>
-      </w:r>
-    </w:p>
-    <w:p>
-      <w:pPr>
-        <w:pStyle w:val="ListParagraph"/>
-        <w:numPr>
-          <w:ilvl w:val="0"/>
-          <w:numId w:val="2"/>
-        </w:numPr>
-        <w:spacing w:after="15"/>
-      </w:pPr>
-      <w:r>
-        <w:t xml:space="preserve">Led a mixed team of engineers, contractors, and interns while remaining hands-on in priority delivery areas.</w:t>
-      </w:r>
-    </w:p>
-    <w:p>
-      <w:pPr>
-        <w:pStyle w:val="ListParagraph"/>
-        <w:numPr>
-          <w:ilvl w:val="0"/>
-          <w:numId w:val="2"/>
-        </w:numPr>
-        <w:spacing w:after="15"/>
-      </w:pPr>
-      <w:r>
-        <w:t xml:space="preserve">Drove feature delivery, performance tuning, and platform hardening that supported 560% user growth while adding new product capabilities.</w:t>
+        <w:t xml:space="preserve">Comcast (via FIS Global / Yoh) | Philadelphia, PA</w:t>
+      </w:r>
+    </w:p>
+    <w:p>
+      <w:pPr>
+        <w:pStyle w:val="ListParagraph"/>
+        <w:numPr>
+          <w:ilvl w:val="0"/>
+          <w:numId w:val="2"/>
+        </w:numPr>
+        <w:spacing w:after="15"/>
+      </w:pPr>
+      <w:r>
+        <w:t xml:space="preserve">Led redesign and re-architecture of Xfinity My Account, a customer-facing platform serving approximately 11 million monthly users; the program received the Creativity International Gold Award for Web Redesign.</w:t>
+      </w:r>
+    </w:p>
+    <w:p>
+      <w:pPr>
+        <w:pStyle w:val="ListParagraph"/>
+        <w:numPr>
+          <w:ilvl w:val="0"/>
+          <w:numId w:val="2"/>
+        </w:numPr>
+        <w:spacing w:after="15"/>
+      </w:pPr>
+      <w:r>
+        <w:t xml:space="preserve">Owned billing and payment journeys, among the highest-traffic self-service flows in the application.</w:t>
+      </w:r>
+    </w:p>
+    <w:p>
+      <w:pPr>
+        <w:pStyle w:val="ListParagraph"/>
+        <w:numPr>
+          <w:ilvl w:val="0"/>
+          <w:numId w:val="2"/>
+        </w:numPr>
+        <w:spacing w:after="15"/>
+      </w:pPr>
+      <w:r>
+        <w:t xml:space="preserve">Partnered with product, design, and service architecture leaders to deliver 26 major releases in 19 months while controlling scope churn through disciplined backlog and release management.</w:t>
+      </w:r>
+    </w:p>
+    <w:p>
+      <w:pPr>
+        <w:pStyle w:val="ListParagraph"/>
+        <w:numPr>
+          <w:ilvl w:val="0"/>
+          <w:numId w:val="2"/>
+        </w:numPr>
+        <w:spacing w:after="15"/>
+      </w:pPr>
+      <w:r>
+        <w:t xml:space="preserve">Delivered the program ahead of schedule and under budget, streamlining billing journeys and improving bill-payment completion.</w:t>
       </w:r>
     </w:p>
     <w:p>
@@ -662,7 +636,7 @@
           <w:b/>
           <w:bCs/>
         </w:rPr>
-        <w:t xml:space="preserve">User Interface Architect / Tech Lead</w:t>
+        <w:t xml:space="preserve">Chief Product Officer</w:t>
       </w:r>
       <w:r>
         <w:rPr>
@@ -670,7 +644,7 @@
           <w:iCs/>
           <w:color w:val="4B5A6A"/>
         </w:rPr>
-        <w:t xml:space="preserve">	11/2013 - 05/2015</w:t>
+        <w:t xml:space="preserve">	05/2015 - 02/2016</w:t>
       </w:r>
     </w:p>
     <w:p>
@@ -681,59 +655,33 @@
         <w:rPr>
           <w:color w:val="4B5A6A"/>
         </w:rPr>
-        <w:t xml:space="preserve">EY Design Studio (formerly Intuitive Company) | Philadelphia, PA</w:t>
-      </w:r>
-    </w:p>
-    <w:p>
-      <w:pPr>
-        <w:pStyle w:val="ListParagraph"/>
-        <w:numPr>
-          <w:ilvl w:val="0"/>
-          <w:numId w:val="2"/>
-        </w:numPr>
-        <w:spacing w:after="15"/>
-      </w:pPr>
-      <w:r>
-        <w:t xml:space="preserve">Served as technical lead on multidisciplinary teams delivering custom enterprise solutions across three concurrent client engagements.</w:t>
-      </w:r>
-    </w:p>
-    <w:p>
-      <w:pPr>
-        <w:pStyle w:val="ListParagraph"/>
-        <w:numPr>
-          <w:ilvl w:val="0"/>
-          <w:numId w:val="2"/>
-        </w:numPr>
-        <w:spacing w:after="15"/>
-      </w:pPr>
-      <w:r>
-        <w:t xml:space="preserve">Led UI architecture and technical planning efforts in partnership with principals and engagement leads.</w:t>
-      </w:r>
-    </w:p>
-    <w:p>
-      <w:pPr>
-        <w:pStyle w:val="ListParagraph"/>
-        <w:numPr>
-          <w:ilvl w:val="0"/>
-          <w:numId w:val="2"/>
-        </w:numPr>
-        <w:spacing w:after="15"/>
-      </w:pPr>
-      <w:r>
-        <w:t xml:space="preserve">Improved delivery predictability and reduced rework through stronger architecture, planning, and client strategy alignment.</w:t>
-      </w:r>
-    </w:p>
-    <w:p>
-      <w:pPr>
-        <w:pStyle w:val="ListParagraph"/>
-        <w:numPr>
-          <w:ilvl w:val="0"/>
-          <w:numId w:val="2"/>
-        </w:numPr>
-        <w:spacing w:after="15"/>
-      </w:pPr>
-      <w:r>
-        <w:t xml:space="preserve">Worked closely with cross-functional teams in design-heavy consulting engagements where front-end quality and collaboration were central to success.</w:t>
+        <w:t xml:space="preserve">Cnverg | Philadelphia, PA</w:t>
+      </w:r>
+    </w:p>
+    <w:p>
+      <w:pPr>
+        <w:pStyle w:val="ListParagraph"/>
+        <w:numPr>
+          <w:ilvl w:val="0"/>
+          <w:numId w:val="2"/>
+        </w:numPr>
+        <w:spacing w:after="15"/>
+      </w:pPr>
+      <w:r>
+        <w:t xml:space="preserve">Took a prototype-stage product to market in under six months by stabilizing the codebase and formalizing delivery practices.</w:t>
+      </w:r>
+    </w:p>
+    <w:p>
+      <w:pPr>
+        <w:pStyle w:val="ListParagraph"/>
+        <w:numPr>
+          <w:ilvl w:val="0"/>
+          <w:numId w:val="2"/>
+        </w:numPr>
+        <w:spacing w:after="15"/>
+      </w:pPr>
+      <w:r>
+        <w:t xml:space="preserve">Led a mixed team of engineers, contractors, and interns, driving performance tuning and platform hardening that supported 560% user growth.</w:t>
       </w:r>
     </w:p>
     <w:p>
@@ -753,7 +701,7 @@
           <w:b/>
           <w:bCs/>
         </w:rPr>
-        <w:t xml:space="preserve">Earlier Career</w:t>
+        <w:t xml:space="preserve">User Interface Architect / Tech Lead</w:t>
       </w:r>
       <w:r>
         <w:rPr>
@@ -761,6 +709,71 @@
           <w:iCs/>
           <w:color w:val="4B5A6A"/>
         </w:rPr>
+        <w:t xml:space="preserve">	11/2013 - 05/2015</w:t>
+      </w:r>
+    </w:p>
+    <w:p>
+      <w:pPr>
+        <w:spacing w:after="30"/>
+      </w:pPr>
+      <w:r>
+        <w:rPr>
+          <w:color w:val="4B5A6A"/>
+        </w:rPr>
+        <w:t xml:space="preserve">EY Design Studio (formerly Intuitive Company) | Philadelphia, PA</w:t>
+      </w:r>
+    </w:p>
+    <w:p>
+      <w:pPr>
+        <w:pStyle w:val="ListParagraph"/>
+        <w:numPr>
+          <w:ilvl w:val="0"/>
+          <w:numId w:val="2"/>
+        </w:numPr>
+        <w:spacing w:after="15"/>
+      </w:pPr>
+      <w:r>
+        <w:t xml:space="preserve">Served as technical lead on multidisciplinary teams delivering custom enterprise solutions across three concurrent client engagements.</w:t>
+      </w:r>
+    </w:p>
+    <w:p>
+      <w:pPr>
+        <w:pStyle w:val="ListParagraph"/>
+        <w:numPr>
+          <w:ilvl w:val="0"/>
+          <w:numId w:val="2"/>
+        </w:numPr>
+        <w:spacing w:after="15"/>
+      </w:pPr>
+      <w:r>
+        <w:t xml:space="preserve">Led UI architecture and technical planning in partnership with principals and engagement leads, improving delivery predictability and reducing rework.</w:t>
+      </w:r>
+    </w:p>
+    <w:p>
+      <w:pPr>
+        <w:spacing w:after="25"/>
+      </w:pPr>
+    </w:p>
+    <w:p>
+      <w:pPr>
+        <w:tabs>
+          <w:tab w:val="right" w:pos="9300"/>
+        </w:tabs>
+        <w:spacing w:after="15"/>
+      </w:pPr>
+      <w:r>
+        <w:rPr>
+          <w:b/>
+          <w:bCs/>
+        </w:rPr>
+        <w:t xml:space="preserve">Earlier Career</w:t>
+      </w:r>
+      <w:r>
+        <w:rPr>
+          <w:i/>
+          <w:iCs/>
+          <w:color w:val="4B5A6A"/>
+        </w:rPr>
         <w:t xml:space="preserve">	2003 – 2013</w:t>
       </w:r>
     </w:p>
@@ -774,33 +787,20 @@
         <w:spacing w:after="15"/>
       </w:pPr>
       <w:r>
-        <w:t xml:space="preserve">Delivered 25+ web and systems engineering projects as an independent contractor across multiple industries, with 90% repeat-client business and 95% on-time delivery.</w:t>
-      </w:r>
-    </w:p>
-    <w:p>
-      <w:pPr>
-        <w:pStyle w:val="ListParagraph"/>
-        <w:numPr>
-          <w:ilvl w:val="0"/>
-          <w:numId w:val="2"/>
-        </w:numPr>
-        <w:spacing w:after="15"/>
-      </w:pPr>
-      <w:r>
-        <w:t xml:space="preserve">As a UI Developer at cPanel, contributed to a major interface overhaul used by millions of end users, improving usability metrics such as task completion and time-to-complete by 80%.</w:t>
-      </w:r>
-    </w:p>
-    <w:p>
-      <w:pPr>
-        <w:pStyle w:val="ListParagraph"/>
-        <w:numPr>
-          <w:ilvl w:val="0"/>
-          <w:numId w:val="2"/>
-        </w:numPr>
-        <w:spacing w:after="15"/>
-      </w:pPr>
-      <w:r>
-        <w:t xml:space="preserve">As Director of IT at Exam Master Corporation, led infrastructure modernization and platform redevelopment as greenfield initiatives that established scalable foundations for future reliability and support operations.</w:t>
+        <w:t xml:space="preserve">Delivered 25+ web and systems engineering projects as an independent contractor, with 90% repeat-client business and 95% on-time delivery.</w:t>
+      </w:r>
+    </w:p>
+    <w:p>
+      <w:pPr>
+        <w:pStyle w:val="ListParagraph"/>
+        <w:numPr>
+          <w:ilvl w:val="0"/>
+          <w:numId w:val="2"/>
+        </w:numPr>
+        <w:spacing w:after="15"/>
+      </w:pPr>
+      <w:r>
+        <w:t xml:space="preserve">As a UI Developer at cPanel, contributed to a major interface overhaul used by millions of end users, improving task completion and time-to-complete by 80%.</w:t>
       </w:r>
     </w:p>
     <w:sectPr>

</xml_diff>

<commit_message>
Soften Comcast leadership claims to match team structure
"Led" -> "a lead engineer" for both Comcast stints, noting tiger-team
leadership on the My Account program; "Delivered" -> "Helped deliver"
for program-level outcomes. Regenerated resume documents.

Co-Authored-By: Claude Fable 5 <noreply@anthropic.com>
</commit_message>
<xml_diff>
--- a/resume/resume.docx
+++ b/resume/resume.docx
@@ -421,7 +421,7 @@
         <w:spacing w:after="15"/>
       </w:pPr>
       <w:r>
-        <w:t xml:space="preserve">Led engineering for four high-visibility initiatives across Comcast's digital sales and account management platforms.</w:t>
+        <w:t xml:space="preserve">Served as a lead engineer on four high-visibility initiatives across Comcast's digital sales and account management platforms.</w:t>
       </w:r>
     </w:p>
     <w:p>
@@ -577,7 +577,7 @@
         <w:spacing w:after="15"/>
       </w:pPr>
       <w:r>
-        <w:t xml:space="preserve">Led redesign and re-architecture of Xfinity My Account, a customer-facing platform serving approximately 11 million monthly users; the program received the Creativity International Gold Award for Web Redesign.</w:t>
+        <w:t xml:space="preserve">Served as a lead engineer on the redesign and re-architecture of Xfinity My Account, a customer-facing platform serving approximately 11 million monthly users, leading tiger teams within the program; the redesign received the Creativity International Gold Award for Web Redesign.</w:t>
       </w:r>
     </w:p>
     <w:p>
@@ -616,7 +616,7 @@
         <w:spacing w:after="15"/>
       </w:pPr>
       <w:r>
-        <w:t xml:space="preserve">Delivered the program ahead of schedule and under budget, streamlining billing journeys and improving bill-payment completion.</w:t>
+        <w:t xml:space="preserve">Helped deliver the program ahead of schedule and under budget, streamlining billing journeys and improving bill-payment completion.</w:t>
       </w:r>
     </w:p>
     <w:p>

</xml_diff>